<commit_message>
POO S1 (Intro POO + Entorno Java): profundizacion a nivel riguroso
</commit_message>
<xml_diff>
--- a/01-week/optional-activity/pdf/Actividad-Semana01.docx
+++ b/01-week/optional-activity/pdf/Actividad-Semana01.docx
@@ -31,7 +31,7 @@
           <w:sz w:val="22"/>
           <w:szCs w:val="22"/>
         </w:rPr>
-        <w:t xml:space="preserve">Programación y Diseño Orientado a Objetos · Semana 1 · Configura tu entorno Java y tu primer programa</w:t>
+        <w:t xml:space="preserve">Programación y Diseño Orientado a Objetos · Semana 1 · Entorno Java, primer programa y modelado de objetos</w:t>
       </w:r>
     </w:p>
     <w:tbl>
@@ -430,7 +430,7 @@
           <w:sz w:val="22"/>
           <w:szCs w:val="22"/>
         </w:rPr>
-        <w:t xml:space="preserve">Instalar el JDK y un IDE funcionando.</w:t>
+        <w:t xml:space="preserve">Verificar la instalación del JDK y compilar/ejecutar desde la terminal.</w:t>
       </w:r>
     </w:p>
     <w:p>
@@ -454,7 +454,7 @@
           <w:sz w:val="22"/>
           <w:szCs w:val="22"/>
         </w:rPr>
-        <w:t xml:space="preserve">Compilar y ejecutar un programa Java.</w:t>
+        <w:t xml:space="preserve">Escribir una primera clase con estado y comportamiento.</w:t>
       </w:r>
     </w:p>
     <w:p>
@@ -478,7 +478,7 @@
           <w:sz w:val="22"/>
           <w:szCs w:val="22"/>
         </w:rPr>
-        <w:t xml:space="preserve">Escribir una primera clase propia.</w:t>
+        <w:t xml:space="preserve">Modelar un dominio identificando clases, atributos y métodos.</w:t>
       </w:r>
     </w:p>
     <w:p>
@@ -503,26 +503,8 @@
     <w:p>
       <w:pPr>
         <w:spacing w:after="120" w:line="276" w:lineRule="auto"/>
-        <w:ind w:left="454" w:hanging="284"/>
-      </w:pPr>
-      <w:r>
-        <w:rPr>
-          <w:rFonts w:ascii="Times New Roman" w:hAnsi="Times New Roman" w:cs="Times New Roman"/>
-          <w:color w:val="000000"/>
-          <w:sz w:val="22"/>
-          <w:szCs w:val="22"/>
-        </w:rPr>
-        <w:t xml:space="preserve">1.	</w:t>
-      </w:r>
-      <w:r>
-        <w:rPr>
-          <w:rFonts w:ascii="Times New Roman" w:hAnsi="Times New Roman" w:cs="Times New Roman"/>
-          <w:color w:val="000000"/>
-          <w:sz w:val="22"/>
-          <w:szCs w:val="22"/>
-        </w:rPr>
-        <w:t xml:space="preserve">Instala el </w:t>
-      </w:r>
+        <w:jc w:val="both"/>
+      </w:pPr>
       <w:r>
         <w:rPr>
           <w:rFonts w:ascii="Times New Roman" w:hAnsi="Times New Roman" w:cs="Times New Roman"/>
@@ -531,35 +513,7 @@
           <w:sz w:val="22"/>
           <w:szCs w:val="22"/>
         </w:rPr>
-        <w:t xml:space="preserve">JDK</w:t>
-      </w:r>
-      <w:r>
-        <w:rPr>
-          <w:rFonts w:ascii="Times New Roman" w:hAnsi="Times New Roman" w:cs="Times New Roman"/>
-          <w:color w:val="000000"/>
-          <w:sz w:val="22"/>
-          <w:szCs w:val="22"/>
-        </w:rPr>
-        <w:t xml:space="preserve"> y un </w:t>
-      </w:r>
-      <w:r>
-        <w:rPr>
-          <w:rFonts w:ascii="Times New Roman" w:hAnsi="Times New Roman" w:cs="Times New Roman"/>
-          <w:b/>
-          <w:color w:val="000000"/>
-          <w:sz w:val="22"/>
-          <w:szCs w:val="22"/>
-        </w:rPr>
-        <w:t xml:space="preserve">IDE</w:t>
-      </w:r>
-      <w:r>
-        <w:rPr>
-          <w:rFonts w:ascii="Times New Roman" w:hAnsi="Times New Roman" w:cs="Times New Roman"/>
-          <w:color w:val="000000"/>
-          <w:sz w:val="22"/>
-          <w:szCs w:val="22"/>
-        </w:rPr>
-        <w:t xml:space="preserve"> (IntelliJ, Eclipse o VS Code con Java).</w:t>
+        <w:t xml:space="preserve">Parte A — Entorno y ejecución (obligatoria).</w:t>
       </w:r>
     </w:p>
     <w:p>
@@ -574,16 +528,35 @@
           <w:sz w:val="22"/>
           <w:szCs w:val="22"/>
         </w:rPr>
-        <w:t xml:space="preserve">2.	</w:t>
-      </w:r>
-      <w:r>
-        <w:rPr>
-          <w:rFonts w:ascii="Times New Roman" w:hAnsi="Times New Roman" w:cs="Times New Roman"/>
-          <w:color w:val="000000"/>
-          <w:sz w:val="22"/>
-          <w:szCs w:val="22"/>
-        </w:rPr>
-        <w:t xml:space="preserve">Crea y ejecuta un </w:t>
+        <w:t xml:space="preserve">1.	</w:t>
+      </w:r>
+      <w:r>
+        <w:rPr>
+          <w:rFonts w:ascii="Times New Roman" w:hAnsi="Times New Roman" w:cs="Times New Roman"/>
+          <w:color w:val="000000"/>
+          <w:sz w:val="22"/>
+          <w:szCs w:val="22"/>
+        </w:rPr>
+        <w:t xml:space="preserve">Instala el </w:t>
+      </w:r>
+      <w:r>
+        <w:rPr>
+          <w:rFonts w:ascii="Times New Roman" w:hAnsi="Times New Roman" w:cs="Times New Roman"/>
+          <w:b/>
+          <w:color w:val="000000"/>
+          <w:sz w:val="22"/>
+          <w:szCs w:val="22"/>
+        </w:rPr>
+        <w:t xml:space="preserve">JDK</w:t>
+      </w:r>
+      <w:r>
+        <w:rPr>
+          <w:rFonts w:ascii="Times New Roman" w:hAnsi="Times New Roman" w:cs="Times New Roman"/>
+          <w:color w:val="000000"/>
+          <w:sz w:val="22"/>
+          <w:szCs w:val="22"/>
+        </w:rPr>
+        <w:t xml:space="preserve"> y verifica en terminal: </w:t>
       </w:r>
       <w:r>
         <w:rPr>
@@ -592,16 +565,34 @@
           <w:sz w:val="22"/>
           <w:szCs w:val="22"/>
         </w:rPr>
-        <w:t xml:space="preserve">HolaMundo</w:t>
-      </w:r>
-      <w:r>
-        <w:rPr>
-          <w:rFonts w:ascii="Times New Roman" w:hAnsi="Times New Roman" w:cs="Times New Roman"/>
-          <w:color w:val="000000"/>
-          <w:sz w:val="22"/>
-          <w:szCs w:val="22"/>
-        </w:rPr>
-        <w:t xml:space="preserve"> que imprima un saludo.</w:t>
+        <w:t xml:space="preserve">java -version</w:t>
+      </w:r>
+      <w:r>
+        <w:rPr>
+          <w:rFonts w:ascii="Times New Roman" w:hAnsi="Times New Roman" w:cs="Times New Roman"/>
+          <w:color w:val="000000"/>
+          <w:sz w:val="22"/>
+          <w:szCs w:val="22"/>
+        </w:rPr>
+        <w:t xml:space="preserve"> y </w:t>
+      </w:r>
+      <w:r>
+        <w:rPr>
+          <w:rFonts w:ascii="Consolas" w:hAnsi="Consolas" w:cs="Consolas"/>
+          <w:color w:val="000000"/>
+          <w:sz w:val="22"/>
+          <w:szCs w:val="22"/>
+        </w:rPr>
+        <w:t xml:space="preserve">javac -version</w:t>
+      </w:r>
+      <w:r>
+        <w:rPr>
+          <w:rFonts w:ascii="Times New Roman" w:hAnsi="Times New Roman" w:cs="Times New Roman"/>
+          <w:color w:val="000000"/>
+          <w:sz w:val="22"/>
+          <w:szCs w:val="22"/>
+        </w:rPr>
+        <w:t xml:space="preserve">.</w:t>
       </w:r>
     </w:p>
     <w:p>
@@ -616,16 +607,16 @@
           <w:sz w:val="22"/>
           <w:szCs w:val="22"/>
         </w:rPr>
-        <w:t xml:space="preserve">3.	</w:t>
-      </w:r>
-      <w:r>
-        <w:rPr>
-          <w:rFonts w:ascii="Times New Roman" w:hAnsi="Times New Roman" w:cs="Times New Roman"/>
-          <w:color w:val="000000"/>
-          <w:sz w:val="22"/>
-          <w:szCs w:val="22"/>
-        </w:rPr>
-        <w:t xml:space="preserve">Crea una clase </w:t>
+        <w:t xml:space="preserve">2.	</w:t>
+      </w:r>
+      <w:r>
+        <w:rPr>
+          <w:rFonts w:ascii="Times New Roman" w:hAnsi="Times New Roman" w:cs="Times New Roman"/>
+          <w:color w:val="000000"/>
+          <w:sz w:val="22"/>
+          <w:szCs w:val="22"/>
+        </w:rPr>
+        <w:t xml:space="preserve">Crea </w:t>
       </w:r>
       <w:r>
         <w:rPr>
@@ -634,39 +625,75 @@
           <w:sz w:val="22"/>
           <w:szCs w:val="22"/>
         </w:rPr>
-        <w:t xml:space="preserve">Estudiante</w:t>
-      </w:r>
-      <w:r>
-        <w:rPr>
-          <w:rFonts w:ascii="Times New Roman" w:hAnsi="Times New Roman" w:cs="Times New Roman"/>
-          <w:color w:val="000000"/>
-          <w:sz w:val="22"/>
-          <w:szCs w:val="22"/>
-        </w:rPr>
-        <w:t xml:space="preserve"> con un método </w:t>
-      </w:r>
-      <w:r>
-        <w:rPr>
-          <w:rFonts w:ascii="Consolas" w:hAnsi="Consolas" w:cs="Consolas"/>
-          <w:color w:val="000000"/>
-          <w:sz w:val="22"/>
-          <w:szCs w:val="22"/>
-        </w:rPr>
-        <w:t xml:space="preserve">presentarse()</w:t>
-      </w:r>
-      <w:r>
-        <w:rPr>
-          <w:rFonts w:ascii="Times New Roman" w:hAnsi="Times New Roman" w:cs="Times New Roman"/>
-          <w:color w:val="000000"/>
-          <w:sz w:val="22"/>
-          <w:szCs w:val="22"/>
-        </w:rPr>
-        <w:t xml:space="preserve"> que imprima tu nombre y programa.</w:t>
+        <w:t xml:space="preserve">HolaMundo.java</w:t>
+      </w:r>
+      <w:r>
+        <w:rPr>
+          <w:rFonts w:ascii="Times New Roman" w:hAnsi="Times New Roman" w:cs="Times New Roman"/>
+          <w:color w:val="000000"/>
+          <w:sz w:val="22"/>
+          <w:szCs w:val="22"/>
+        </w:rPr>
+        <w:t xml:space="preserve">, </w:t>
+      </w:r>
+      <w:r>
+        <w:rPr>
+          <w:rFonts w:ascii="Times New Roman" w:hAnsi="Times New Roman" w:cs="Times New Roman"/>
+          <w:b/>
+          <w:color w:val="000000"/>
+          <w:sz w:val="22"/>
+          <w:szCs w:val="22"/>
+        </w:rPr>
+        <w:t xml:space="preserve">compílalo con `javac`</w:t>
+      </w:r>
+      <w:r>
+        <w:rPr>
+          <w:rFonts w:ascii="Times New Roman" w:hAnsi="Times New Roman" w:cs="Times New Roman"/>
+          <w:color w:val="000000"/>
+          <w:sz w:val="22"/>
+          <w:szCs w:val="22"/>
+        </w:rPr>
+        <w:t xml:space="preserve"> y </w:t>
+      </w:r>
+      <w:r>
+        <w:rPr>
+          <w:rFonts w:ascii="Times New Roman" w:hAnsi="Times New Roman" w:cs="Times New Roman"/>
+          <w:b/>
+          <w:color w:val="000000"/>
+          <w:sz w:val="22"/>
+          <w:szCs w:val="22"/>
+        </w:rPr>
+        <w:t xml:space="preserve">ejecútalo con `java`</w:t>
+      </w:r>
+      <w:r>
+        <w:rPr>
+          <w:rFonts w:ascii="Times New Roman" w:hAnsi="Times New Roman" w:cs="Times New Roman"/>
+          <w:color w:val="000000"/>
+          <w:sz w:val="22"/>
+          <w:szCs w:val="22"/>
+        </w:rPr>
+        <w:t xml:space="preserve"> desde la terminal (adjunta captura).</w:t>
       </w:r>
     </w:p>
     <w:p>
       <w:pPr>
         <w:spacing w:after="120" w:line="276" w:lineRule="auto"/>
+        <w:jc w:val="both"/>
+      </w:pPr>
+      <w:r>
+        <w:rPr>
+          <w:rFonts w:ascii="Times New Roman" w:hAnsi="Times New Roman" w:cs="Times New Roman"/>
+          <w:b/>
+          <w:color w:val="000000"/>
+          <w:sz w:val="22"/>
+          <w:szCs w:val="22"/>
+        </w:rPr>
+        <w:t xml:space="preserve">Parte B — Primer objeto.</w:t>
+      </w:r>
+    </w:p>
+    <w:p>
+      <w:pPr>
+        <w:spacing w:after="120" w:line="276" w:lineRule="auto"/>
         <w:ind w:left="454" w:hanging="284"/>
       </w:pPr>
       <w:r>
@@ -676,16 +703,16 @@
           <w:sz w:val="22"/>
           <w:szCs w:val="22"/>
         </w:rPr>
-        <w:t xml:space="preserve">4.	</w:t>
-      </w:r>
-      <w:r>
-        <w:rPr>
-          <w:rFonts w:ascii="Times New Roman" w:hAnsi="Times New Roman" w:cs="Times New Roman"/>
-          <w:color w:val="000000"/>
-          <w:sz w:val="22"/>
-          <w:szCs w:val="22"/>
-        </w:rPr>
-        <w:t xml:space="preserve">Desde </w:t>
+        <w:t xml:space="preserve">1.	</w:t>
+      </w:r>
+      <w:r>
+        <w:rPr>
+          <w:rFonts w:ascii="Times New Roman" w:hAnsi="Times New Roman" w:cs="Times New Roman"/>
+          <w:color w:val="000000"/>
+          <w:sz w:val="22"/>
+          <w:szCs w:val="22"/>
+        </w:rPr>
+        <w:t xml:space="preserve">Crea una clase </w:t>
       </w:r>
       <w:r>
         <w:rPr>
@@ -694,16 +721,16 @@
           <w:sz w:val="22"/>
           <w:szCs w:val="22"/>
         </w:rPr>
-        <w:t xml:space="preserve">main</w:t>
-      </w:r>
-      <w:r>
-        <w:rPr>
-          <w:rFonts w:ascii="Times New Roman" w:hAnsi="Times New Roman" w:cs="Times New Roman"/>
-          <w:color w:val="000000"/>
-          <w:sz w:val="22"/>
-          <w:szCs w:val="22"/>
-        </w:rPr>
-        <w:t xml:space="preserve">, crea un objeto </w:t>
+        <w:t xml:space="preserve">Estudiante</w:t>
+      </w:r>
+      <w:r>
+        <w:rPr>
+          <w:rFonts w:ascii="Times New Roman" w:hAnsi="Times New Roman" w:cs="Times New Roman"/>
+          <w:color w:val="000000"/>
+          <w:sz w:val="22"/>
+          <w:szCs w:val="22"/>
+        </w:rPr>
+        <w:t xml:space="preserve"> con atributos (</w:t>
       </w:r>
       <w:r>
         <w:rPr>
@@ -712,6 +739,139 @@
           <w:sz w:val="22"/>
           <w:szCs w:val="22"/>
         </w:rPr>
+        <w:t xml:space="preserve">nombre</w:t>
+      </w:r>
+      <w:r>
+        <w:rPr>
+          <w:rFonts w:ascii="Times New Roman" w:hAnsi="Times New Roman" w:cs="Times New Roman"/>
+          <w:color w:val="000000"/>
+          <w:sz w:val="22"/>
+          <w:szCs w:val="22"/>
+        </w:rPr>
+        <w:t xml:space="preserve">, </w:t>
+      </w:r>
+      <w:r>
+        <w:rPr>
+          <w:rFonts w:ascii="Consolas" w:hAnsi="Consolas" w:cs="Consolas"/>
+          <w:color w:val="000000"/>
+          <w:sz w:val="22"/>
+          <w:szCs w:val="22"/>
+        </w:rPr>
+        <w:t xml:space="preserve">programa</w:t>
+      </w:r>
+      <w:r>
+        <w:rPr>
+          <w:rFonts w:ascii="Times New Roman" w:hAnsi="Times New Roman" w:cs="Times New Roman"/>
+          <w:color w:val="000000"/>
+          <w:sz w:val="22"/>
+          <w:szCs w:val="22"/>
+        </w:rPr>
+        <w:t xml:space="preserve">, </w:t>
+      </w:r>
+      <w:r>
+        <w:rPr>
+          <w:rFonts w:ascii="Consolas" w:hAnsi="Consolas" w:cs="Consolas"/>
+          <w:color w:val="000000"/>
+          <w:sz w:val="22"/>
+          <w:szCs w:val="22"/>
+        </w:rPr>
+        <w:t xml:space="preserve">semestre</w:t>
+      </w:r>
+      <w:r>
+        <w:rPr>
+          <w:rFonts w:ascii="Times New Roman" w:hAnsi="Times New Roman" w:cs="Times New Roman"/>
+          <w:color w:val="000000"/>
+          <w:sz w:val="22"/>
+          <w:szCs w:val="22"/>
+        </w:rPr>
+        <w:t xml:space="preserve">) y un método </w:t>
+      </w:r>
+      <w:r>
+        <w:rPr>
+          <w:rFonts w:ascii="Consolas" w:hAnsi="Consolas" w:cs="Consolas"/>
+          <w:color w:val="000000"/>
+          <w:sz w:val="22"/>
+          <w:szCs w:val="22"/>
+        </w:rPr>
+        <w:t xml:space="preserve">presentarse()</w:t>
+      </w:r>
+      <w:r>
+        <w:rPr>
+          <w:rFonts w:ascii="Times New Roman" w:hAnsi="Times New Roman" w:cs="Times New Roman"/>
+          <w:color w:val="000000"/>
+          <w:sz w:val="22"/>
+          <w:szCs w:val="22"/>
+        </w:rPr>
+        <w:t xml:space="preserve"> que imprima una frase con esos datos.</w:t>
+      </w:r>
+    </w:p>
+    <w:p>
+      <w:pPr>
+        <w:spacing w:after="120" w:line="276" w:lineRule="auto"/>
+        <w:ind w:left="454" w:hanging="284"/>
+      </w:pPr>
+      <w:r>
+        <w:rPr>
+          <w:rFonts w:ascii="Times New Roman" w:hAnsi="Times New Roman" w:cs="Times New Roman"/>
+          <w:color w:val="000000"/>
+          <w:sz w:val="22"/>
+          <w:szCs w:val="22"/>
+        </w:rPr>
+        <w:t xml:space="preserve">2.	</w:t>
+      </w:r>
+      <w:r>
+        <w:rPr>
+          <w:rFonts w:ascii="Times New Roman" w:hAnsi="Times New Roman" w:cs="Times New Roman"/>
+          <w:color w:val="000000"/>
+          <w:sz w:val="22"/>
+          <w:szCs w:val="22"/>
+        </w:rPr>
+        <w:t xml:space="preserve">En una clase </w:t>
+      </w:r>
+      <w:r>
+        <w:rPr>
+          <w:rFonts w:ascii="Consolas" w:hAnsi="Consolas" w:cs="Consolas"/>
+          <w:color w:val="000000"/>
+          <w:sz w:val="22"/>
+          <w:szCs w:val="22"/>
+        </w:rPr>
+        <w:t xml:space="preserve">Main</w:t>
+      </w:r>
+      <w:r>
+        <w:rPr>
+          <w:rFonts w:ascii="Times New Roman" w:hAnsi="Times New Roman" w:cs="Times New Roman"/>
+          <w:color w:val="000000"/>
+          <w:sz w:val="22"/>
+          <w:szCs w:val="22"/>
+        </w:rPr>
+        <w:t xml:space="preserve">, crea </w:t>
+      </w:r>
+      <w:r>
+        <w:rPr>
+          <w:rFonts w:ascii="Times New Roman" w:hAnsi="Times New Roman" w:cs="Times New Roman"/>
+          <w:b/>
+          <w:color w:val="000000"/>
+          <w:sz w:val="22"/>
+          <w:szCs w:val="22"/>
+        </w:rPr>
+        <w:t xml:space="preserve">dos</w:t>
+      </w:r>
+      <w:r>
+        <w:rPr>
+          <w:rFonts w:ascii="Times New Roman" w:hAnsi="Times New Roman" w:cs="Times New Roman"/>
+          <w:color w:val="000000"/>
+          <w:sz w:val="22"/>
+          <w:szCs w:val="22"/>
+        </w:rPr>
+        <w:t xml:space="preserve"> objetos </w:t>
+      </w:r>
+      <w:r>
+        <w:rPr>
+          <w:rFonts w:ascii="Consolas" w:hAnsi="Consolas" w:cs="Consolas"/>
+          <w:color w:val="000000"/>
+          <w:sz w:val="22"/>
+          <w:szCs w:val="22"/>
+        </w:rPr>
         <w:t xml:space="preserve">Estudiante</w:t>
       </w:r>
       <w:r>
@@ -721,7 +881,7 @@
           <w:sz w:val="22"/>
           <w:szCs w:val="22"/>
         </w:rPr>
-        <w:t xml:space="preserve"> y llama a </w:t>
+        <w:t xml:space="preserve"> distintos y llama a </w:t>
       </w:r>
       <w:r>
         <w:rPr>
@@ -739,7 +899,85 @@
           <w:sz w:val="22"/>
           <w:szCs w:val="22"/>
         </w:rPr>
-        <w:t xml:space="preserve">.</w:t>
+        <w:t xml:space="preserve"> en cada uno (observa que comparten clase pero tienen estado propio).</w:t>
+      </w:r>
+    </w:p>
+    <w:p>
+      <w:pPr>
+        <w:spacing w:after="120" w:line="276" w:lineRule="auto"/>
+        <w:jc w:val="both"/>
+      </w:pPr>
+      <w:r>
+        <w:rPr>
+          <w:rFonts w:ascii="Times New Roman" w:hAnsi="Times New Roman" w:cs="Times New Roman"/>
+          <w:b/>
+          <w:color w:val="000000"/>
+          <w:sz w:val="22"/>
+          <w:szCs w:val="22"/>
+        </w:rPr>
+        <w:t xml:space="preserve">Parte C — Modelado (análisis).</w:t>
+      </w:r>
+    </w:p>
+    <w:p>
+      <w:pPr>
+        <w:spacing w:after="120" w:line="276" w:lineRule="auto"/>
+        <w:ind w:left="454" w:hanging="284"/>
+      </w:pPr>
+      <w:r>
+        <w:rPr>
+          <w:rFonts w:ascii="Times New Roman" w:hAnsi="Times New Roman" w:cs="Times New Roman"/>
+          <w:color w:val="000000"/>
+          <w:sz w:val="22"/>
+          <w:szCs w:val="22"/>
+        </w:rPr>
+        <w:t xml:space="preserve">1.	</w:t>
+      </w:r>
+      <w:r>
+        <w:rPr>
+          <w:rFonts w:ascii="Times New Roman" w:hAnsi="Times New Roman" w:cs="Times New Roman"/>
+          <w:color w:val="000000"/>
+          <w:sz w:val="22"/>
+          <w:szCs w:val="22"/>
+        </w:rPr>
+        <w:t xml:space="preserve">Elige un dominio real (tienda, clínica, transporte). En el README, identifica </w:t>
+      </w:r>
+      <w:r>
+        <w:rPr>
+          <w:rFonts w:ascii="Times New Roman" w:hAnsi="Times New Roman" w:cs="Times New Roman"/>
+          <w:b/>
+          <w:color w:val="000000"/>
+          <w:sz w:val="22"/>
+          <w:szCs w:val="22"/>
+        </w:rPr>
+        <w:t xml:space="preserve">3 clases</w:t>
+      </w:r>
+      <w:r>
+        <w:rPr>
+          <w:rFonts w:ascii="Times New Roman" w:hAnsi="Times New Roman" w:cs="Times New Roman"/>
+          <w:color w:val="000000"/>
+          <w:sz w:val="22"/>
+          <w:szCs w:val="22"/>
+        </w:rPr>
+        <w:t xml:space="preserve"> con sus atributos y métodos, y explica qué </w:t>
+      </w:r>
+      <w:r>
+        <w:rPr>
+          <w:rFonts w:ascii="Times New Roman" w:hAnsi="Times New Roman" w:cs="Times New Roman"/>
+          <w:b/>
+          <w:color w:val="000000"/>
+          <w:sz w:val="22"/>
+          <w:szCs w:val="22"/>
+        </w:rPr>
+        <w:t xml:space="preserve">abstrajiste</w:t>
+      </w:r>
+      <w:r>
+        <w:rPr>
+          <w:rFonts w:ascii="Times New Roman" w:hAnsi="Times New Roman" w:cs="Times New Roman"/>
+          <w:color w:val="000000"/>
+          <w:sz w:val="22"/>
+          <w:szCs w:val="22"/>
+        </w:rPr>
+        <w:t xml:space="preserve"> (qué dejaste fuera por irrelevante) en cada una.</w:t>
       </w:r>
     </w:p>
     <w:p>
@@ -782,7 +1020,26 @@
           <w:sz w:val="22"/>
           <w:szCs w:val="22"/>
         </w:rPr>
-        <w:t xml:space="preserve">Captura de pantalla del programa ejecutándose.</w:t>
+        <w:t xml:space="preserve">Ejecución desde </w:t>
+      </w:r>
+      <w:r>
+        <w:rPr>
+          <w:rFonts w:ascii="Times New Roman" w:hAnsi="Times New Roman" w:cs="Times New Roman"/>
+          <w:b/>
+          <w:color w:val="000000"/>
+          <w:sz w:val="22"/>
+          <w:szCs w:val="22"/>
+        </w:rPr>
+        <w:t xml:space="preserve">terminal</w:t>
+      </w:r>
+      <w:r>
+        <w:rPr>
+          <w:rFonts w:ascii="Times New Roman" w:hAnsi="Times New Roman" w:cs="Times New Roman"/>
+          <w:color w:val="000000"/>
+          <w:sz w:val="22"/>
+          <w:szCs w:val="22"/>
+        </w:rPr>
+        <w:t xml:space="preserve"> demostrada con captura (no solo IDE).</w:t>
       </w:r>
     </w:p>
     <w:p>
@@ -806,25 +1063,7 @@
           <w:sz w:val="22"/>
           <w:szCs w:val="22"/>
         </w:rPr>
-        <w:t xml:space="preserve">Código compilable (</w:t>
-      </w:r>
-      <w:r>
-        <w:rPr>
-          <w:rFonts w:ascii="Consolas" w:hAnsi="Consolas" w:cs="Consolas"/>
-          <w:color w:val="000000"/>
-          <w:sz w:val="22"/>
-          <w:szCs w:val="22"/>
-        </w:rPr>
-        <w:t xml:space="preserve">javac</w:t>
-      </w:r>
-      <w:r>
-        <w:rPr>
-          <w:rFonts w:ascii="Times New Roman" w:hAnsi="Times New Roman" w:cs="Times New Roman"/>
-          <w:color w:val="000000"/>
-          <w:sz w:val="22"/>
-          <w:szCs w:val="22"/>
-        </w:rPr>
-        <w:t xml:space="preserve"> sin errores).</w:t>
+        <w:t xml:space="preserve">Nombre de archivo = nombre de la clase pública.</w:t>
       </w:r>
     </w:p>
     <w:p>
@@ -848,7 +1087,49 @@
           <w:sz w:val="22"/>
           <w:szCs w:val="22"/>
         </w:rPr>
-        <w:t xml:space="preserve">Nombre de archivo igual al de la clase pública.</w:t>
+        <w:t xml:space="preserve">Dos objetos </w:t>
+      </w:r>
+      <w:r>
+        <w:rPr>
+          <w:rFonts w:ascii="Consolas" w:hAnsi="Consolas" w:cs="Consolas"/>
+          <w:color w:val="000000"/>
+          <w:sz w:val="22"/>
+          <w:szCs w:val="22"/>
+        </w:rPr>
+        <w:t xml:space="preserve">Estudiante</w:t>
+      </w:r>
+      <w:r>
+        <w:rPr>
+          <w:rFonts w:ascii="Times New Roman" w:hAnsi="Times New Roman" w:cs="Times New Roman"/>
+          <w:color w:val="000000"/>
+          <w:sz w:val="22"/>
+          <w:szCs w:val="22"/>
+        </w:rPr>
+        <w:t xml:space="preserve"> con estados distintos.</w:t>
+      </w:r>
+    </w:p>
+    <w:p>
+      <w:pPr>
+        <w:spacing w:after="120" w:line="276" w:lineRule="auto"/>
+        <w:ind w:left="454" w:hanging="284"/>
+      </w:pPr>
+      <w:r>
+        <w:rPr>
+          <w:rFonts w:ascii="Times New Roman" w:hAnsi="Times New Roman" w:cs="Times New Roman"/>
+          <w:color w:val="000000"/>
+          <w:sz w:val="22"/>
+          <w:szCs w:val="22"/>
+        </w:rPr>
+        <w:t xml:space="preserve">•	</w:t>
+      </w:r>
+      <w:r>
+        <w:rPr>
+          <w:rFonts w:ascii="Times New Roman" w:hAnsi="Times New Roman" w:cs="Times New Roman"/>
+          <w:color w:val="000000"/>
+          <w:sz w:val="22"/>
+          <w:szCs w:val="22"/>
+        </w:rPr>
+        <w:t xml:space="preserve">Análisis de modelado con justificación de la abstracción.</w:t>
       </w:r>
     </w:p>
     <w:p>
@@ -951,7 +1232,7 @@
           <w:sz w:val="18"/>
           <w:szCs w:val="18"/>
         </w:rPr>
-        <w:t xml:space="preserve">  README.md   -&gt; pasos + captura de la ejecucion</w:t>
+        <w:t xml:space="preserve">  README.md   -&gt; capturas (java -version, ejecucion) + analisis de modelado</w:t>
       </w:r>
     </w:p>
     <w:p>
@@ -991,7 +1272,7 @@
           <w:sz w:val="22"/>
           <w:szCs w:val="22"/>
         </w:rPr>
-        <w:t xml:space="preserve">Crea el repo público con ese nombre.</w:t>
+        <w:t xml:space="preserve">Crea el repositorio público con ese nombre.</w:t>
       </w:r>
     </w:p>
     <w:p>
@@ -1015,7 +1296,7 @@
           <w:sz w:val="22"/>
           <w:szCs w:val="22"/>
         </w:rPr>
-        <w:t xml:space="preserve">Sube el código y el README con la captura.</w:t>
+        <w:t xml:space="preserve">Sube el código y el README con capturas y el análisis.</w:t>
       </w:r>
     </w:p>
     <w:p>
@@ -1039,7 +1320,7 @@
           <w:sz w:val="22"/>
           <w:szCs w:val="22"/>
         </w:rPr>
-        <w:t xml:space="preserve">Comparte el enlace por el canal indicado.</w:t>
+        <w:t xml:space="preserve">Comparte el enlace por el canal indicado por el docente.</w:t>
       </w:r>
     </w:p>
     <w:p>
@@ -1122,7 +1403,7 @@
                 <w:sz w:val="20"/>
                 <w:szCs w:val="20"/>
               </w:rPr>
-              <w:t xml:space="preserve">Excelente</w:t>
+              <w:t xml:space="preserve">Excelente (100%)</w:t>
             </w:r>
           </w:p>
         </w:tc>
@@ -1144,7 +1425,7 @@
                 <w:sz w:val="20"/>
                 <w:szCs w:val="20"/>
               </w:rPr>
-              <w:t xml:space="preserve">Aceptable</w:t>
+              <w:t xml:space="preserve">Aceptable (60%)</w:t>
             </w:r>
           </w:p>
         </w:tc>
@@ -1166,7 +1447,7 @@
                 <w:sz w:val="20"/>
                 <w:szCs w:val="20"/>
               </w:rPr>
-              <w:t xml:space="preserve">Por mejorar</w:t>
+              <w:t xml:space="preserve">Por mejorar (0%)</w:t>
             </w:r>
           </w:p>
         </w:tc>
@@ -1210,7 +1491,7 @@
                 <w:sz w:val="20"/>
                 <w:szCs w:val="20"/>
               </w:rPr>
-              <w:t xml:space="preserve">Entorno funcionando (captura)</w:t>
+              <w:t xml:space="preserve">Entorno + ejecución en terminal</w:t>
             </w:r>
           </w:p>
         </w:tc>
@@ -1230,7 +1511,7 @@
                 <w:sz w:val="20"/>
                 <w:szCs w:val="20"/>
               </w:rPr>
-              <w:t xml:space="preserve">Claro y correcto</w:t>
+              <w:t xml:space="preserve">Verificado con capturas (javac/java)</w:t>
             </w:r>
           </w:p>
         </w:tc>
@@ -1250,7 +1531,7 @@
                 <w:sz w:val="20"/>
                 <w:szCs w:val="20"/>
               </w:rPr>
-              <w:t xml:space="preserve">Parcial</w:t>
+              <w:t xml:space="preserve">Solo IDE</w:t>
             </w:r>
           </w:p>
         </w:tc>
@@ -1270,7 +1551,7 @@
                 <w:sz w:val="20"/>
                 <w:szCs w:val="20"/>
               </w:rPr>
-              <w:t xml:space="preserve">Ausente</w:t>
+              <w:t xml:space="preserve">No demostrado</w:t>
             </w:r>
           </w:p>
         </w:tc>
@@ -1290,7 +1571,7 @@
                 <w:sz w:val="20"/>
                 <w:szCs w:val="20"/>
               </w:rPr>
-              <w:t xml:space="preserve">30</w:t>
+              <w:t xml:space="preserve">25</w:t>
             </w:r>
           </w:p>
         </w:tc>
@@ -1312,7 +1593,7 @@
                 <w:sz w:val="20"/>
                 <w:szCs w:val="20"/>
               </w:rPr>
-              <w:t xml:space="preserve">HolaMundo ejecutado</w:t>
+              <w:t xml:space="preserve">Clase Estudiante (estado + comportamiento)</w:t>
             </w:r>
           </w:p>
         </w:tc>
@@ -1332,7 +1613,7 @@
                 <w:sz w:val="20"/>
                 <w:szCs w:val="20"/>
               </w:rPr>
-              <w:t xml:space="preserve">Correcto</w:t>
+              <w:t xml:space="preserve">Correcta y clara</w:t>
             </w:r>
           </w:p>
         </w:tc>
@@ -1414,7 +1695,7 @@
                 <w:sz w:val="20"/>
                 <w:szCs w:val="20"/>
               </w:rPr>
-              <w:t xml:space="preserve">Clase Estudiante + presentarse()</w:t>
+              <w:t xml:space="preserve">Dos objetos con estado propio</w:t>
             </w:r>
           </w:p>
         </w:tc>
@@ -1434,7 +1715,7 @@
                 <w:sz w:val="20"/>
                 <w:szCs w:val="20"/>
               </w:rPr>
-              <w:t xml:space="preserve">Correcta</w:t>
+              <w:t xml:space="preserve">Correcto y evidenciado</w:t>
             </w:r>
           </w:p>
         </w:tc>
@@ -1454,7 +1735,7 @@
                 <w:sz w:val="20"/>
                 <w:szCs w:val="20"/>
               </w:rPr>
-              <w:t xml:space="preserve">Con detalles</w:t>
+              <w:t xml:space="preserve">Parcial</w:t>
             </w:r>
           </w:p>
         </w:tc>
@@ -1474,7 +1755,7 @@
                 <w:sz w:val="20"/>
                 <w:szCs w:val="20"/>
               </w:rPr>
-              <w:t xml:space="preserve">Falla</w:t>
+              <w:t xml:space="preserve">Ausente</w:t>
             </w:r>
           </w:p>
         </w:tc>
@@ -1494,7 +1775,7 @@
                 <w:sz w:val="20"/>
                 <w:szCs w:val="20"/>
               </w:rPr>
-              <w:t xml:space="preserve">30</w:t>
+              <w:t xml:space="preserve">20</w:t>
             </w:r>
           </w:p>
         </w:tc>
@@ -1516,6 +1797,108 @@
                 <w:sz w:val="20"/>
                 <w:szCs w:val="20"/>
               </w:rPr>
+              <w:t xml:space="preserve">Modelado + justificación de abstracción</w:t>
+            </w:r>
+          </w:p>
+        </w:tc>
+        <w:tc>
+          <w:tcPr>
+            <w:tcW w:w="0" w:type="auto"/>
+            <w:vAlign w:val="center"/>
+          </w:tcPr>
+          <w:p>
+            <w:pPr>
+              <w:spacing w:after="20" w:before="20"/>
+            </w:pPr>
+            <w:r>
+              <w:rPr>
+                <w:rFonts w:ascii="Times New Roman" w:hAnsi="Times New Roman" w:cs="Times New Roman"/>
+                <w:color w:val="000000"/>
+                <w:sz w:val="20"/>
+                <w:szCs w:val="20"/>
+              </w:rPr>
+              <w:t xml:space="preserve">3 clases bien modeladas y justificadas</w:t>
+            </w:r>
+          </w:p>
+        </w:tc>
+        <w:tc>
+          <w:tcPr>
+            <w:tcW w:w="0" w:type="auto"/>
+            <w:vAlign w:val="center"/>
+          </w:tcPr>
+          <w:p>
+            <w:pPr>
+              <w:spacing w:after="20" w:before="20"/>
+            </w:pPr>
+            <w:r>
+              <w:rPr>
+                <w:rFonts w:ascii="Times New Roman" w:hAnsi="Times New Roman" w:cs="Times New Roman"/>
+                <w:color w:val="000000"/>
+                <w:sz w:val="20"/>
+                <w:szCs w:val="20"/>
+              </w:rPr>
+              <w:t xml:space="preserve">Básico</w:t>
+            </w:r>
+          </w:p>
+        </w:tc>
+        <w:tc>
+          <w:tcPr>
+            <w:tcW w:w="0" w:type="auto"/>
+            <w:vAlign w:val="center"/>
+          </w:tcPr>
+          <w:p>
+            <w:pPr>
+              <w:spacing w:after="20" w:before="20"/>
+            </w:pPr>
+            <w:r>
+              <w:rPr>
+                <w:rFonts w:ascii="Times New Roman" w:hAnsi="Times New Roman" w:cs="Times New Roman"/>
+                <w:color w:val="000000"/>
+                <w:sz w:val="20"/>
+                <w:szCs w:val="20"/>
+              </w:rPr>
+              <w:t xml:space="preserve">Ausente</w:t>
+            </w:r>
+          </w:p>
+        </w:tc>
+        <w:tc>
+          <w:tcPr>
+            <w:tcW w:w="0" w:type="auto"/>
+            <w:vAlign w:val="center"/>
+          </w:tcPr>
+          <w:p>
+            <w:pPr>
+              <w:spacing w:after="20" w:before="20"/>
+            </w:pPr>
+            <w:r>
+              <w:rPr>
+                <w:rFonts w:ascii="Times New Roman" w:hAnsi="Times New Roman" w:cs="Times New Roman"/>
+                <w:color w:val="000000"/>
+                <w:sz w:val="20"/>
+                <w:szCs w:val="20"/>
+              </w:rPr>
+              <w:t xml:space="preserve">20</w:t>
+            </w:r>
+          </w:p>
+        </w:tc>
+      </w:tr>
+      <w:tr>
+        <w:tc>
+          <w:tcPr>
+            <w:tcW w:w="0" w:type="auto"/>
+            <w:vAlign w:val="center"/>
+          </w:tcPr>
+          <w:p>
+            <w:pPr>
+              <w:spacing w:after="20" w:before="20"/>
+            </w:pPr>
+            <w:r>
+              <w:rPr>
+                <w:rFonts w:ascii="Times New Roman" w:hAnsi="Times New Roman" w:cs="Times New Roman"/>
+                <w:color w:val="000000"/>
+                <w:sz w:val="20"/>
+                <w:szCs w:val="20"/>
+              </w:rPr>
               <w:t xml:space="preserve">README y repositorio</w:t>
             </w:r>
           </w:p>
@@ -1536,7 +1919,7 @@
                 <w:sz w:val="20"/>
                 <w:szCs w:val="20"/>
               </w:rPr>
-              <w:t xml:space="preserve">Ordenado</w:t>
+              <w:t xml:space="preserve">Ordenado y claro</w:t>
             </w:r>
           </w:p>
         </w:tc>
@@ -1596,7 +1979,7 @@
                 <w:sz w:val="20"/>
                 <w:szCs w:val="20"/>
               </w:rPr>
-              <w:t xml:space="preserve">15</w:t>
+              <w:t xml:space="preserve">10</w:t>
             </w:r>
           </w:p>
         </w:tc>
@@ -1615,7 +1998,7 @@
           <w:sz w:val="21"/>
           <w:szCs w:val="21"/>
         </w:rPr>
-        <w:t xml:space="preserve">Nota: actividad formativa y opcional (sin nota en Moodle). La guía unificada de entrega estará en el Manual de Entrega de Actividades Opcionales (próximamente).</w:t>
+        <w:t xml:space="preserve">Nota: actividad formativa y opcional (sin nota en Moodle). La guía unificada para entregar todas las actividades opcionales, válida para todas las materias, estará en el Manual de Entrega de Actividades Opcionales (próximamente).</w:t>
       </w:r>
     </w:p>
     <w:sectPr>

</xml_diff>

<commit_message>
Optional-activity: alinear entrega al modelo fork del repo de la clase + enlace al Manual GitHub
Co-Authored-By: Claude Opus 4.8 <noreply@anthropic.com>
</commit_message>
<xml_diff>
--- a/01-week/optional-activity/pdf/Actividad-Semana01.docx
+++ b/01-week/optional-activity/pdf/Actividad-Semana01.docx
@@ -1148,7 +1148,7 @@
           <w:sz w:val="26"/>
           <w:szCs w:val="26"/>
         </w:rPr>
-        <w:t xml:space="preserve">3. Cómo entregar</w:t>
+        <w:t xml:space="preserve">3. Cómo entregar (por GitHub)</w:t>
       </w:r>
     </w:p>
     <w:p>
@@ -1163,7 +1163,7 @@
           <w:sz w:val="22"/>
           <w:szCs w:val="22"/>
         </w:rPr>
-        <w:t xml:space="preserve">Entrega </w:t>
+        <w:t xml:space="preserve">Las entregas se realizan en </w:t>
       </w:r>
       <w:r>
         <w:rPr>
@@ -1173,82 +1173,237 @@
           <w:sz w:val="22"/>
           <w:szCs w:val="22"/>
         </w:rPr>
-        <w:t xml:space="preserve">por GitHub</w:t>
-      </w:r>
-      <w:r>
-        <w:rPr>
-          <w:rFonts w:ascii="Times New Roman" w:hAnsi="Times New Roman" w:cs="Times New Roman"/>
-          <w:color w:val="000000"/>
-          <w:sz w:val="22"/>
-          <w:szCs w:val="22"/>
-        </w:rPr>
-        <w:t xml:space="preserve">. Repositorio: </w:t>
-      </w:r>
-      <w:r>
-        <w:rPr>
-          <w:rFonts w:ascii="Consolas" w:hAnsi="Consolas" w:cs="Consolas"/>
-          <w:color w:val="000000"/>
-          <w:sz w:val="22"/>
-          <w:szCs w:val="22"/>
-        </w:rPr>
-        <w:t xml:space="preserve">poo-s01-entorno</w:t>
-      </w:r>
-      <w:r>
-        <w:rPr>
-          <w:rFonts w:ascii="Times New Roman" w:hAnsi="Times New Roman" w:cs="Times New Roman"/>
-          <w:color w:val="000000"/>
-          <w:sz w:val="22"/>
-          <w:szCs w:val="22"/>
-        </w:rPr>
-        <w:t xml:space="preserve">.</w:t>
+        <w:t xml:space="preserve">tu fork del repositorio de la clase</w:t>
+      </w:r>
+      <w:r>
+        <w:rPr>
+          <w:rFonts w:ascii="Times New Roman" w:hAnsi="Times New Roman" w:cs="Times New Roman"/>
+          <w:color w:val="000000"/>
+          <w:sz w:val="22"/>
+          <w:szCs w:val="22"/>
+        </w:rPr>
+        <w:t xml:space="preserve">, dentro de la carpeta de esta semana. Si nunca has usado GitHub, sigue el </w:t>
+      </w:r>
+      <w:r>
+        <w:rPr>
+          <w:rFonts w:ascii="Times New Roman" w:hAnsi="Times New Roman" w:cs="Times New Roman"/>
+          <w:b/>
+          <w:color w:val="000000"/>
+          <w:sz w:val="22"/>
+          <w:szCs w:val="22"/>
+        </w:rPr>
+        <w:t xml:space="preserve">[Manual de Entrega por GitHub](https://code-corhuila.github.io/ova-web/manuales/Manual-Entrega-GitHub.pdf)</w:t>
+      </w:r>
+      <w:r>
+        <w:rPr>
+          <w:rFonts w:ascii="Times New Roman" w:hAnsi="Times New Roman" w:cs="Times New Roman"/>
+          <w:color w:val="000000"/>
+          <w:sz w:val="22"/>
+          <w:szCs w:val="22"/>
+        </w:rPr>
+        <w:t xml:space="preserve"> paso a paso.</w:t>
       </w:r>
     </w:p>
     <w:p>
       <w:pPr>
-        <w:spacing w:after="0" w:line="276" w:lineRule="auto"/>
-        <w:ind w:left="120"/>
-        <w:shd w:val="clear" w:color="auto" w:fill="F0F4F4"/>
-      </w:pPr>
-      <w:r>
-        <w:rPr>
-          <w:rFonts w:ascii="Consolas" w:hAnsi="Consolas" w:cs="Consolas"/>
-          <w:color w:val="2C3E50"/>
-          <w:sz w:val="18"/>
-          <w:szCs w:val="18"/>
-        </w:rPr>
-        <w:t xml:space="preserve">poo-s01-entorno/</w:t>
+        <w:spacing w:after="120" w:line="276" w:lineRule="auto"/>
+        <w:ind w:left="454" w:hanging="284"/>
+      </w:pPr>
+      <w:r>
+        <w:rPr>
+          <w:rFonts w:ascii="Times New Roman" w:hAnsi="Times New Roman" w:cs="Times New Roman"/>
+          <w:color w:val="000000"/>
+          <w:sz w:val="22"/>
+          <w:szCs w:val="22"/>
+        </w:rPr>
+        <w:t xml:space="preserve">1.	</w:t>
+      </w:r>
+      <w:r>
+        <w:rPr>
+          <w:rFonts w:ascii="Times New Roman" w:hAnsi="Times New Roman" w:cs="Times New Roman"/>
+          <w:color w:val="000000"/>
+          <w:sz w:val="22"/>
+          <w:szCs w:val="22"/>
+        </w:rPr>
+        <w:t xml:space="preserve">Haz </w:t>
+      </w:r>
+      <w:r>
+        <w:rPr>
+          <w:rFonts w:ascii="Times New Roman" w:hAnsi="Times New Roman" w:cs="Times New Roman"/>
+          <w:b/>
+          <w:color w:val="000000"/>
+          <w:sz w:val="22"/>
+          <w:szCs w:val="22"/>
+        </w:rPr>
+        <w:t xml:space="preserve">fork</w:t>
+      </w:r>
+      <w:r>
+        <w:rPr>
+          <w:rFonts w:ascii="Times New Roman" w:hAnsi="Times New Roman" w:cs="Times New Roman"/>
+          <w:color w:val="000000"/>
+          <w:sz w:val="22"/>
+          <w:szCs w:val="22"/>
+        </w:rPr>
+        <w:t xml:space="preserve"> del repositorio de la clase (enlace dado por el docente) y </w:t>
+      </w:r>
+      <w:r>
+        <w:rPr>
+          <w:rFonts w:ascii="Times New Roman" w:hAnsi="Times New Roman" w:cs="Times New Roman"/>
+          <w:b/>
+          <w:color w:val="000000"/>
+          <w:sz w:val="22"/>
+          <w:szCs w:val="22"/>
+        </w:rPr>
+        <w:t xml:space="preserve">clónalo</w:t>
+      </w:r>
+      <w:r>
+        <w:rPr>
+          <w:rFonts w:ascii="Times New Roman" w:hAnsi="Times New Roman" w:cs="Times New Roman"/>
+          <w:color w:val="000000"/>
+          <w:sz w:val="22"/>
+          <w:szCs w:val="22"/>
+        </w:rPr>
+        <w:t xml:space="preserve">.</w:t>
       </w:r>
     </w:p>
     <w:p>
       <w:pPr>
-        <w:spacing w:after="0" w:line="276" w:lineRule="auto"/>
-        <w:ind w:left="120"/>
-        <w:shd w:val="clear" w:color="auto" w:fill="F0F4F4"/>
-      </w:pPr>
-      <w:r>
-        <w:rPr>
-          <w:rFonts w:ascii="Consolas" w:hAnsi="Consolas" w:cs="Consolas"/>
-          <w:color w:val="2C3E50"/>
-          <w:sz w:val="18"/>
-          <w:szCs w:val="18"/>
-        </w:rPr>
-        <w:t xml:space="preserve">  README.md   -&gt; capturas (java -version, ejecucion) + analisis de modelado</w:t>
+        <w:spacing w:after="120" w:line="276" w:lineRule="auto"/>
+        <w:ind w:left="454" w:hanging="284"/>
+      </w:pPr>
+      <w:r>
+        <w:rPr>
+          <w:rFonts w:ascii="Times New Roman" w:hAnsi="Times New Roman" w:cs="Times New Roman"/>
+          <w:color w:val="000000"/>
+          <w:sz w:val="22"/>
+          <w:szCs w:val="22"/>
+        </w:rPr>
+        <w:t xml:space="preserve">2.	</w:t>
+      </w:r>
+      <w:r>
+        <w:rPr>
+          <w:rFonts w:ascii="Times New Roman" w:hAnsi="Times New Roman" w:cs="Times New Roman"/>
+          <w:color w:val="000000"/>
+          <w:sz w:val="22"/>
+          <w:szCs w:val="22"/>
+        </w:rPr>
+        <w:t xml:space="preserve">Coloca tu entrega en la carpeta </w:t>
+      </w:r>
+      <w:r>
+        <w:rPr>
+          <w:rFonts w:ascii="Times New Roman" w:hAnsi="Times New Roman" w:cs="Times New Roman"/>
+          <w:b/>
+          <w:color w:val="000000"/>
+          <w:sz w:val="22"/>
+          <w:szCs w:val="22"/>
+        </w:rPr>
+        <w:t xml:space="preserve">`01-week/`</w:t>
+      </w:r>
+      <w:r>
+        <w:rPr>
+          <w:rFonts w:ascii="Times New Roman" w:hAnsi="Times New Roman" w:cs="Times New Roman"/>
+          <w:color w:val="000000"/>
+          <w:sz w:val="22"/>
+          <w:szCs w:val="22"/>
+        </w:rPr>
+        <w:t xml:space="preserve"> correspondiente a esta semana.</w:t>
       </w:r>
     </w:p>
     <w:p>
       <w:pPr>
-        <w:spacing w:after="0" w:line="276" w:lineRule="auto"/>
-        <w:ind w:left="120"/>
-        <w:shd w:val="clear" w:color="auto" w:fill="F0F4F4"/>
-      </w:pPr>
+        <w:spacing w:after="120" w:line="276" w:lineRule="auto"/>
+        <w:ind w:left="454" w:hanging="284"/>
+      </w:pPr>
+      <w:r>
+        <w:rPr>
+          <w:rFonts w:ascii="Times New Roman" w:hAnsi="Times New Roman" w:cs="Times New Roman"/>
+          <w:color w:val="000000"/>
+          <w:sz w:val="22"/>
+          <w:szCs w:val="22"/>
+        </w:rPr>
+        <w:t xml:space="preserve">3.	</w:t>
+      </w:r>
+      <w:r>
+        <w:rPr>
+          <w:rFonts w:ascii="Times New Roman" w:hAnsi="Times New Roman" w:cs="Times New Roman"/>
+          <w:color w:val="000000"/>
+          <w:sz w:val="22"/>
+          <w:szCs w:val="22"/>
+        </w:rPr>
+        <w:t xml:space="preserve">Sube los cambios: </w:t>
+      </w:r>
       <w:r>
         <w:rPr>
           <w:rFonts w:ascii="Consolas" w:hAnsi="Consolas" w:cs="Consolas"/>
-          <w:color w:val="2C3E50"/>
-          <w:sz w:val="18"/>
-          <w:szCs w:val="18"/>
-        </w:rPr>
-        <w:t xml:space="preserve">  src/         -&gt; HolaMundo.java, Estudiante.java, Main.java</w:t>
+          <w:color w:val="000000"/>
+          <w:sz w:val="22"/>
+          <w:szCs w:val="22"/>
+        </w:rPr>
+        <w:t xml:space="preserve">git add .</w:t>
+      </w:r>
+      <w:r>
+        <w:rPr>
+          <w:rFonts w:ascii="Times New Roman" w:hAnsi="Times New Roman" w:cs="Times New Roman"/>
+          <w:color w:val="000000"/>
+          <w:sz w:val="22"/>
+          <w:szCs w:val="22"/>
+        </w:rPr>
+        <w:t xml:space="preserve"> · </w:t>
+      </w:r>
+      <w:r>
+        <w:rPr>
+          <w:rFonts w:ascii="Consolas" w:hAnsi="Consolas" w:cs="Consolas"/>
+          <w:color w:val="000000"/>
+          <w:sz w:val="22"/>
+          <w:szCs w:val="22"/>
+        </w:rPr>
+        <w:t xml:space="preserve">git commit -m "Entrega semana 01"</w:t>
+      </w:r>
+      <w:r>
+        <w:rPr>
+          <w:rFonts w:ascii="Times New Roman" w:hAnsi="Times New Roman" w:cs="Times New Roman"/>
+          <w:color w:val="000000"/>
+          <w:sz w:val="22"/>
+          <w:szCs w:val="22"/>
+        </w:rPr>
+        <w:t xml:space="preserve"> · </w:t>
+      </w:r>
+      <w:r>
+        <w:rPr>
+          <w:rFonts w:ascii="Consolas" w:hAnsi="Consolas" w:cs="Consolas"/>
+          <w:color w:val="000000"/>
+          <w:sz w:val="22"/>
+          <w:szCs w:val="22"/>
+        </w:rPr>
+        <w:t xml:space="preserve">git push</w:t>
+      </w:r>
+      <w:r>
+        <w:rPr>
+          <w:rFonts w:ascii="Times New Roman" w:hAnsi="Times New Roman" w:cs="Times New Roman"/>
+          <w:color w:val="000000"/>
+          <w:sz w:val="22"/>
+          <w:szCs w:val="22"/>
+        </w:rPr>
+        <w:t xml:space="preserve"> (abre un </w:t>
+      </w:r>
+      <w:r>
+        <w:rPr>
+          <w:rFonts w:ascii="Times New Roman" w:hAnsi="Times New Roman" w:cs="Times New Roman"/>
+          <w:i/>
+          <w:color w:val="000000"/>
+          <w:sz w:val="22"/>
+          <w:szCs w:val="22"/>
+        </w:rPr>
+        <w:t xml:space="preserve">Pull Request</w:t>
+      </w:r>
+      <w:r>
+        <w:rPr>
+          <w:rFonts w:ascii="Times New Roman" w:hAnsi="Times New Roman" w:cs="Times New Roman"/>
+          <w:color w:val="000000"/>
+          <w:sz w:val="22"/>
+          <w:szCs w:val="22"/>
+        </w:rPr>
+        <w:t xml:space="preserve"> si el docente lo pide).</w:t>
       </w:r>
     </w:p>
     <w:p>
@@ -1263,64 +1418,90 @@
           <w:sz w:val="22"/>
           <w:szCs w:val="22"/>
         </w:rPr>
-        <w:t xml:space="preserve">1.	</w:t>
-      </w:r>
-      <w:r>
-        <w:rPr>
-          <w:rFonts w:ascii="Times New Roman" w:hAnsi="Times New Roman" w:cs="Times New Roman"/>
-          <w:color w:val="000000"/>
-          <w:sz w:val="22"/>
-          <w:szCs w:val="22"/>
-        </w:rPr>
-        <w:t xml:space="preserve">Crea el repositorio público con ese nombre.</w:t>
-      </w:r>
-    </w:p>
-    <w:p>
-      <w:pPr>
-        <w:spacing w:after="120" w:line="276" w:lineRule="auto"/>
-        <w:ind w:left="454" w:hanging="284"/>
-      </w:pPr>
-      <w:r>
-        <w:rPr>
-          <w:rFonts w:ascii="Times New Roman" w:hAnsi="Times New Roman" w:cs="Times New Roman"/>
-          <w:color w:val="000000"/>
-          <w:sz w:val="22"/>
-          <w:szCs w:val="22"/>
-        </w:rPr>
-        <w:t xml:space="preserve">2.	</w:t>
-      </w:r>
-      <w:r>
-        <w:rPr>
-          <w:rFonts w:ascii="Times New Roman" w:hAnsi="Times New Roman" w:cs="Times New Roman"/>
-          <w:color w:val="000000"/>
-          <w:sz w:val="22"/>
-          <w:szCs w:val="22"/>
-        </w:rPr>
-        <w:t xml:space="preserve">Sube el código y el README con capturas y el análisis.</w:t>
-      </w:r>
-    </w:p>
-    <w:p>
-      <w:pPr>
-        <w:spacing w:after="120" w:line="276" w:lineRule="auto"/>
-        <w:ind w:left="454" w:hanging="284"/>
-      </w:pPr>
-      <w:r>
-        <w:rPr>
-          <w:rFonts w:ascii="Times New Roman" w:hAnsi="Times New Roman" w:cs="Times New Roman"/>
-          <w:color w:val="000000"/>
-          <w:sz w:val="22"/>
-          <w:szCs w:val="22"/>
-        </w:rPr>
-        <w:t xml:space="preserve">3.	</w:t>
-      </w:r>
-      <w:r>
-        <w:rPr>
-          <w:rFonts w:ascii="Times New Roman" w:hAnsi="Times New Roman" w:cs="Times New Roman"/>
-          <w:color w:val="000000"/>
-          <w:sz w:val="22"/>
-          <w:szCs w:val="22"/>
-        </w:rPr>
-        <w:t xml:space="preserve">Comparte el enlace por el canal indicado por el docente.</w:t>
+        <w:t xml:space="preserve">4.	</w:t>
+      </w:r>
+      <w:r>
+        <w:rPr>
+          <w:rFonts w:ascii="Times New Roman" w:hAnsi="Times New Roman" w:cs="Times New Roman"/>
+          <w:color w:val="000000"/>
+          <w:sz w:val="22"/>
+          <w:szCs w:val="22"/>
+        </w:rPr>
+        <w:t xml:space="preserve">Verifica que tienes tu </w:t>
+      </w:r>
+      <w:r>
+        <w:rPr>
+          <w:rFonts w:ascii="Times New Roman" w:hAnsi="Times New Roman" w:cs="Times New Roman"/>
+          <w:b/>
+          <w:color w:val="000000"/>
+          <w:sz w:val="22"/>
+          <w:szCs w:val="22"/>
+        </w:rPr>
+        <w:t xml:space="preserve">repo de perfil</w:t>
+      </w:r>
+      <w:r>
+        <w:rPr>
+          <w:rFonts w:ascii="Times New Roman" w:hAnsi="Times New Roman" w:cs="Times New Roman"/>
+          <w:color w:val="000000"/>
+          <w:sz w:val="22"/>
+          <w:szCs w:val="22"/>
+        </w:rPr>
+        <w:t xml:space="preserve"> con el bloque </w:t>
+      </w:r>
+      <w:r>
+        <w:rPr>
+          <w:rFonts w:ascii="Times New Roman" w:hAnsi="Times New Roman" w:cs="Times New Roman"/>
+          <w:b/>
+          <w:color w:val="000000"/>
+          <w:sz w:val="22"/>
+          <w:szCs w:val="22"/>
+        </w:rPr>
+        <w:t xml:space="preserve">CONFIG</w:t>
+      </w:r>
+      <w:r>
+        <w:rPr>
+          <w:rFonts w:ascii="Times New Roman" w:hAnsi="Times New Roman" w:cs="Times New Roman"/>
+          <w:color w:val="000000"/>
+          <w:sz w:val="22"/>
+          <w:szCs w:val="22"/>
+        </w:rPr>
+        <w:t xml:space="preserve"> (</w:t>
+      </w:r>
+      <w:r>
+        <w:rPr>
+          <w:rFonts w:ascii="Consolas" w:hAnsi="Consolas" w:cs="Consolas"/>
+          <w:color w:val="000000"/>
+          <w:sz w:val="22"/>
+          <w:szCs w:val="22"/>
+        </w:rPr>
+        <w:t xml:space="preserve">FULL_NAME</w:t>
+      </w:r>
+      <w:r>
+        <w:rPr>
+          <w:rFonts w:ascii="Times New Roman" w:hAnsi="Times New Roman" w:cs="Times New Roman"/>
+          <w:color w:val="000000"/>
+          <w:sz w:val="22"/>
+          <w:szCs w:val="22"/>
+        </w:rPr>
+        <w:t xml:space="preserve"> + </w:t>
+      </w:r>
+      <w:r>
+        <w:rPr>
+          <w:rFonts w:ascii="Consolas" w:hAnsi="Consolas" w:cs="Consolas"/>
+          <w:color w:val="000000"/>
+          <w:sz w:val="22"/>
+          <w:szCs w:val="22"/>
+        </w:rPr>
+        <w:t xml:space="preserve">GITHUB_USER</w:t>
+      </w:r>
+      <w:r>
+        <w:rPr>
+          <w:rFonts w:ascii="Times New Roman" w:hAnsi="Times New Roman" w:cs="Times New Roman"/>
+          <w:color w:val="000000"/>
+          <w:sz w:val="22"/>
+          <w:szCs w:val="22"/>
+        </w:rPr>
+        <w:t xml:space="preserve">); sin él, tus entregas no se detectan.</w:t>
       </w:r>
     </w:p>
     <w:p>

</xml_diff>